<commit_message>
docs: adopt SQLModel as ORM, add AGENTS.md and Library Skills wiring
- SRS/README/BUILD_PLAN updated to use SQLModel (SQLAlchemy + Pydantic in
  one model) instead of raw SQLAlchemy, per updated source SRS.
- Adds AGENTS.md documenting Library Skills: official, version-synced AI
  coding-agent skills bundled with FastAPI and SQLModel, installed via
  `uvx library-skills --claude` into .claude/skills/.
- Wires AGENTS.md into CLAUDE.md (new "AI Agent Skills" section) and adds
  the install step to BUILD_PLAN.md Phase 1.
- Strengthens CLAUDE.md's phase-execution rules: BUILD_PLAN.md checklist
  must be updated immediately per task, and any new work discovered
  mid-phase must be added to BUILD_PLAN.md as it happens.
</commit_message>
<xml_diff>
--- a/docs/SmartReco_SRS.docx
+++ b/docs/SmartReco_SRS.docx
@@ -971,7 +971,7 @@
         </w:rPr>
         <w:t xml:space="preserve">Mesh API documentation: </w:t>
       </w:r>
-      <w:hyperlink w:history="1" r:id="rIdcycos6ruf_iuuxalxmovl">
+      <w:hyperlink w:history="1" r:id="rIdmiqrftujkqq_8_opt9ydw">
         <w:r>
           <w:rPr>
             <w:rStyle w:val="Hyperlink"/>
@@ -999,7 +999,7 @@
           <w:sz w:val="21"/>
           <w:szCs w:val="21"/>
         </w:rPr>
-        <w:t xml:space="preserve">Qdrant, FastAPI, SQLAlchemy, LangGraph, APScheduler, LangSmith </w:t>
+        <w:t xml:space="preserve">Qdrant, FastAPI, SQLModel, LangGraph, APScheduler, LangSmith </w:t>
       </w:r>
       <w:r>
         <w:rPr>
@@ -1439,7 +1439,7 @@
           <w:sz w:val="21"/>
           <w:szCs w:val="21"/>
         </w:rPr>
-        <w:t xml:space="preserve">SQLite for development (zero-config, single file); Postgres-ready via SQLAlchemy and a single DATABASE_URL change.</w:t>
+        <w:t xml:space="preserve">SQLite for development (zero-config, single file); Postgres-ready via SQLModel and a single DATABASE_URL change.</w:t>
       </w:r>
     </w:p>
     <w:p>
@@ -2513,7 +2513,7 @@
           <w:sz w:val="18"/>
           <w:szCs w:val="18"/>
         </w:rPr>
-        <w:t xml:space="preserve">  [ Relational DB (SQLite/Postgres via SQLAlchemy) ]     [ Email provider ]</w:t>
+        <w:t xml:space="preserve">  [ Relational DB (SQLite/Postgres via SQLModel) ]       [ Email provider ]</w:t>
       </w:r>
       <w:r>
         <w:br/>
@@ -2826,7 +2826,7 @@
           <w:sz w:val="18"/>
           <w:szCs w:val="18"/>
         </w:rPr>
-        <w:t xml:space="preserve">    db.py                  # SQLAlchemy engine/session</w:t>
+        <w:t xml:space="preserve">    db.py                  # SQLModel engine/session (SQLAlchemy under the hood)</w:t>
       </w:r>
       <w:r>
         <w:br/>
@@ -2838,7 +2838,7 @@
           <w:sz w:val="18"/>
           <w:szCs w:val="18"/>
         </w:rPr>
-        <w:t xml:space="preserve">    models/                # ORM models: user, product, event, recommendation</w:t>
+        <w:t xml:space="preserve">    models/                # SQLModel tables: user, product, event, recommendation</w:t>
       </w:r>
       <w:r>
         <w:br/>
@@ -2850,7 +2850,7 @@
           <w:sz w:val="18"/>
           <w:szCs w:val="18"/>
         </w:rPr>
-        <w:t xml:space="preserve">    schemas/               # Pydantic request/response models</w:t>
+        <w:t xml:space="preserve">    schemas/               # SQLModel/Pydantic request/response models</w:t>
       </w:r>
       <w:r>
         <w:br/>
@@ -3629,7 +3629,7 @@
                 <w:sz w:val="18"/>
                 <w:szCs w:val="18"/>
               </w:rPr>
-              <w:t xml:space="preserve">SQLite for zero-config dev/demo; Postgres-ready via SQLAlchemy + DATABASE_URL.</w:t>
+              <w:t xml:space="preserve">SQLite for zero-config dev/demo; Postgres-ready via SQLModel + DATABASE_URL.</w:t>
             </w:r>
           </w:p>
         </w:tc>
@@ -3656,7 +3656,7 @@
                 <w:sz w:val="18"/>
                 <w:szCs w:val="18"/>
               </w:rPr>
-              <w:t xml:space="preserve">ORM</w:t>
+              <w:t xml:space="preserve">ORM / models</w:t>
             </w:r>
           </w:p>
         </w:tc>
@@ -3681,7 +3681,7 @@
                 <w:sz w:val="18"/>
                 <w:szCs w:val="18"/>
               </w:rPr>
-              <w:t xml:space="preserve">SQLAlchemy</w:t>
+              <w:t xml:space="preserve">SQLModel</w:t>
             </w:r>
           </w:p>
         </w:tc>
@@ -3706,7 +3706,7 @@
                 <w:sz w:val="18"/>
                 <w:szCs w:val="18"/>
               </w:rPr>
-              <w:t xml:space="preserve">DB-agnostic models; one-line switch from SQLite to Postgres.</w:t>
+              <w:t xml:space="preserve">SQLAlchemy + Pydantic in one model (FastAPI author); one class is both ORM table and schema; still SQLite→Postgres via DATABASE_URL.</w:t>
             </w:r>
           </w:p>
         </w:tc>
@@ -4015,6 +4015,123 @@
                 <w:szCs w:val="18"/>
               </w:rPr>
               <w:t xml:space="preserve">Simple email/password with hashing (passlib/bcrypt); two roles.</w:t>
+            </w:r>
+          </w:p>
+        </w:tc>
+      </w:tr>
+    </w:tbl>
+    <w:p>
+      <w:pPr>
+        <w:spacing w:after="40"/>
+      </w:pPr>
+    </w:p>
+    <w:tbl>
+      <w:tblPr>
+        <w:tblW w:type="pct" w:w="100%"/>
+        <w:tblBorders>
+          <w:top w:val="none"/>
+          <w:left w:val="single" w:color="1B7A6E" w:sz="18"/>
+          <w:bottom w:val="none"/>
+          <w:right w:val="none"/>
+          <w:insideH w:val="none"/>
+          <w:insideV w:val="none"/>
+        </w:tblBorders>
+      </w:tblPr>
+      <w:tblGrid>
+        <w:gridCol w:w="9360"/>
+      </w:tblGrid>
+      <w:tr>
+        <w:tc>
+          <w:tcPr>
+            <w:tcW w:type="dxa" w:w="9360"/>
+            <w:shd w:fill="E7F3F0" w:val="clear"/>
+            <w:tcMar>
+              <w:top w:type="dxa" w:w="120"/>
+              <w:left w:type="dxa" w:w="160"/>
+              <w:bottom w:type="dxa" w:w="120"/>
+              <w:right w:type="dxa" w:w="160"/>
+            </w:tcMar>
+          </w:tcPr>
+          <w:p>
+            <w:pPr>
+              <w:spacing w:after="40"/>
+            </w:pPr>
+            <w:r>
+              <w:rPr>
+                <w:b/>
+                <w:bCs/>
+                <w:color w:val="1B7A6E"/>
+                <w:sz w:val="20"/>
+                <w:szCs w:val="20"/>
+              </w:rPr>
+              <w:t xml:space="preserve">Note on related tooling (optional / out of scope)</w:t>
+            </w:r>
+          </w:p>
+          <w:p>
+            <w:pPr>
+              <w:spacing w:after="40"/>
+            </w:pPr>
+            <w:r>
+              <w:rPr>
+                <w:color w:val="1A1A2E"/>
+                <w:sz w:val="20"/>
+                <w:szCs w:val="20"/>
+              </w:rPr>
+              <w:t xml:space="preserve">Access to the relational database is kept </w:t>
+            </w:r>
+            <w:r>
+              <w:rPr>
+                <w:b/>
+                <w:bCs/>
+                <w:color w:val="1A1A2E"/>
+                <w:sz w:val="20"/>
+                <w:szCs w:val="20"/>
+              </w:rPr>
+              <w:t xml:space="preserve">synchronous</w:t>
+            </w:r>
+            <w:r>
+              <w:rPr>
+                <w:color w:val="1A1A2E"/>
+                <w:sz w:val="20"/>
+                <w:szCs w:val="20"/>
+              </w:rPr>
+              <w:t xml:space="preserve"> for simplicity and demo reliability — adequate at hackathon scale and the most readable for review; SQLModel also supports async if ever needed. </w:t>
+            </w:r>
+            <w:r>
+              <w:rPr>
+                <w:b/>
+                <w:bCs/>
+                <w:color w:val="1A1A2E"/>
+                <w:sz w:val="20"/>
+                <w:szCs w:val="20"/>
+              </w:rPr>
+              <w:t xml:space="preserve">Typer</w:t>
+            </w:r>
+            <w:r>
+              <w:rPr>
+                <w:color w:val="1A1A2E"/>
+                <w:sz w:val="20"/>
+                <w:szCs w:val="20"/>
+              </w:rPr>
+              <w:t xml:space="preserve"> (typed CLI) is an optional nicety for the seed script’s flags and is not core scope. </w:t>
+            </w:r>
+            <w:r>
+              <w:rPr>
+                <w:b/>
+                <w:bCs/>
+                <w:color w:val="1A1A2E"/>
+                <w:sz w:val="20"/>
+                <w:szCs w:val="20"/>
+              </w:rPr>
+              <w:t xml:space="preserve">Asyncer</w:t>
+            </w:r>
+            <w:r>
+              <w:rPr>
+                <w:color w:val="1A1A2E"/>
+                <w:sz w:val="20"/>
+                <w:szCs w:val="20"/>
+              </w:rPr>
+              <w:t xml:space="preserve"> (sync/async bridging) is not required and is intentionally omitted unless a concrete need arises.</w:t>
             </w:r>
           </w:p>
         </w:tc>
@@ -7596,7 +7713,7 @@
                 <w:sz w:val="18"/>
                 <w:szCs w:val="18"/>
               </w:rPr>
-              <w:t xml:space="preserve">Clear module boundaries; a single LLMClient wrapper; DB-agnostic ORM; readable for automated + human review.</w:t>
+              <w:t xml:space="preserve">Clear module boundaries; a single LLMClient wrapper; DB-agnostic SQLModel models; readable for automated + human review.</w:t>
             </w:r>
           </w:p>
         </w:tc>
@@ -8879,7 +8996,7 @@
                 <w:sz w:val="18"/>
                 <w:szCs w:val="18"/>
               </w:rPr>
-              <w:t xml:space="preserve">FastAPI app (uv), SQLAlchemy models, auth + roles, Jinja2 shell.</w:t>
+              <w:t xml:space="preserve">FastAPI app (uv), SQLModel models, auth + roles, Jinja2 shell.</w:t>
             </w:r>
           </w:p>
         </w:tc>

</xml_diff>

<commit_message>
docs: adopt SQLModel as ORM, add AGENTS.md and Library Skills wiring (#2)
- SRS/README/BUILD_PLAN updated to use SQLModel (SQLAlchemy + Pydantic in
  one model) instead of raw SQLAlchemy, per updated source SRS.
- Adds AGENTS.md documenting Library Skills: official, version-synced AI
  coding-agent skills bundled with FastAPI and SQLModel, installed via
  `uvx library-skills --claude` into .claude/skills/.
- Wires AGENTS.md into CLAUDE.md (new "AI Agent Skills" section) and adds
  the install step to BUILD_PLAN.md Phase 1.
- Strengthens CLAUDE.md's phase-execution rules: BUILD_PLAN.md checklist
  must be updated immediately per task, and any new work discovered
  mid-phase must be added to BUILD_PLAN.md as it happens.
</commit_message>
<xml_diff>
--- a/docs/SmartReco_SRS.docx
+++ b/docs/SmartReco_SRS.docx
@@ -971,7 +971,7 @@
         </w:rPr>
         <w:t xml:space="preserve">Mesh API documentation: </w:t>
       </w:r>
-      <w:hyperlink w:history="1" r:id="rIdcycos6ruf_iuuxalxmovl">
+      <w:hyperlink w:history="1" r:id="rIdmiqrftujkqq_8_opt9ydw">
         <w:r>
           <w:rPr>
             <w:rStyle w:val="Hyperlink"/>
@@ -999,7 +999,7 @@
           <w:sz w:val="21"/>
           <w:szCs w:val="21"/>
         </w:rPr>
-        <w:t xml:space="preserve">Qdrant, FastAPI, SQLAlchemy, LangGraph, APScheduler, LangSmith </w:t>
+        <w:t xml:space="preserve">Qdrant, FastAPI, SQLModel, LangGraph, APScheduler, LangSmith </w:t>
       </w:r>
       <w:r>
         <w:rPr>
@@ -1439,7 +1439,7 @@
           <w:sz w:val="21"/>
           <w:szCs w:val="21"/>
         </w:rPr>
-        <w:t xml:space="preserve">SQLite for development (zero-config, single file); Postgres-ready via SQLAlchemy and a single DATABASE_URL change.</w:t>
+        <w:t xml:space="preserve">SQLite for development (zero-config, single file); Postgres-ready via SQLModel and a single DATABASE_URL change.</w:t>
       </w:r>
     </w:p>
     <w:p>
@@ -2513,7 +2513,7 @@
           <w:sz w:val="18"/>
           <w:szCs w:val="18"/>
         </w:rPr>
-        <w:t xml:space="preserve">  [ Relational DB (SQLite/Postgres via SQLAlchemy) ]     [ Email provider ]</w:t>
+        <w:t xml:space="preserve">  [ Relational DB (SQLite/Postgres via SQLModel) ]       [ Email provider ]</w:t>
       </w:r>
       <w:r>
         <w:br/>
@@ -2826,7 +2826,7 @@
           <w:sz w:val="18"/>
           <w:szCs w:val="18"/>
         </w:rPr>
-        <w:t xml:space="preserve">    db.py                  # SQLAlchemy engine/session</w:t>
+        <w:t xml:space="preserve">    db.py                  # SQLModel engine/session (SQLAlchemy under the hood)</w:t>
       </w:r>
       <w:r>
         <w:br/>
@@ -2838,7 +2838,7 @@
           <w:sz w:val="18"/>
           <w:szCs w:val="18"/>
         </w:rPr>
-        <w:t xml:space="preserve">    models/                # ORM models: user, product, event, recommendation</w:t>
+        <w:t xml:space="preserve">    models/                # SQLModel tables: user, product, event, recommendation</w:t>
       </w:r>
       <w:r>
         <w:br/>
@@ -2850,7 +2850,7 @@
           <w:sz w:val="18"/>
           <w:szCs w:val="18"/>
         </w:rPr>
-        <w:t xml:space="preserve">    schemas/               # Pydantic request/response models</w:t>
+        <w:t xml:space="preserve">    schemas/               # SQLModel/Pydantic request/response models</w:t>
       </w:r>
       <w:r>
         <w:br/>
@@ -3629,7 +3629,7 @@
                 <w:sz w:val="18"/>
                 <w:szCs w:val="18"/>
               </w:rPr>
-              <w:t xml:space="preserve">SQLite for zero-config dev/demo; Postgres-ready via SQLAlchemy + DATABASE_URL.</w:t>
+              <w:t xml:space="preserve">SQLite for zero-config dev/demo; Postgres-ready via SQLModel + DATABASE_URL.</w:t>
             </w:r>
           </w:p>
         </w:tc>
@@ -3656,7 +3656,7 @@
                 <w:sz w:val="18"/>
                 <w:szCs w:val="18"/>
               </w:rPr>
-              <w:t xml:space="preserve">ORM</w:t>
+              <w:t xml:space="preserve">ORM / models</w:t>
             </w:r>
           </w:p>
         </w:tc>
@@ -3681,7 +3681,7 @@
                 <w:sz w:val="18"/>
                 <w:szCs w:val="18"/>
               </w:rPr>
-              <w:t xml:space="preserve">SQLAlchemy</w:t>
+              <w:t xml:space="preserve">SQLModel</w:t>
             </w:r>
           </w:p>
         </w:tc>
@@ -3706,7 +3706,7 @@
                 <w:sz w:val="18"/>
                 <w:szCs w:val="18"/>
               </w:rPr>
-              <w:t xml:space="preserve">DB-agnostic models; one-line switch from SQLite to Postgres.</w:t>
+              <w:t xml:space="preserve">SQLAlchemy + Pydantic in one model (FastAPI author); one class is both ORM table and schema; still SQLite→Postgres via DATABASE_URL.</w:t>
             </w:r>
           </w:p>
         </w:tc>
@@ -4015,6 +4015,123 @@
                 <w:szCs w:val="18"/>
               </w:rPr>
               <w:t xml:space="preserve">Simple email/password with hashing (passlib/bcrypt); two roles.</w:t>
+            </w:r>
+          </w:p>
+        </w:tc>
+      </w:tr>
+    </w:tbl>
+    <w:p>
+      <w:pPr>
+        <w:spacing w:after="40"/>
+      </w:pPr>
+    </w:p>
+    <w:tbl>
+      <w:tblPr>
+        <w:tblW w:type="pct" w:w="100%"/>
+        <w:tblBorders>
+          <w:top w:val="none"/>
+          <w:left w:val="single" w:color="1B7A6E" w:sz="18"/>
+          <w:bottom w:val="none"/>
+          <w:right w:val="none"/>
+          <w:insideH w:val="none"/>
+          <w:insideV w:val="none"/>
+        </w:tblBorders>
+      </w:tblPr>
+      <w:tblGrid>
+        <w:gridCol w:w="9360"/>
+      </w:tblGrid>
+      <w:tr>
+        <w:tc>
+          <w:tcPr>
+            <w:tcW w:type="dxa" w:w="9360"/>
+            <w:shd w:fill="E7F3F0" w:val="clear"/>
+            <w:tcMar>
+              <w:top w:type="dxa" w:w="120"/>
+              <w:left w:type="dxa" w:w="160"/>
+              <w:bottom w:type="dxa" w:w="120"/>
+              <w:right w:type="dxa" w:w="160"/>
+            </w:tcMar>
+          </w:tcPr>
+          <w:p>
+            <w:pPr>
+              <w:spacing w:after="40"/>
+            </w:pPr>
+            <w:r>
+              <w:rPr>
+                <w:b/>
+                <w:bCs/>
+                <w:color w:val="1B7A6E"/>
+                <w:sz w:val="20"/>
+                <w:szCs w:val="20"/>
+              </w:rPr>
+              <w:t xml:space="preserve">Note on related tooling (optional / out of scope)</w:t>
+            </w:r>
+          </w:p>
+          <w:p>
+            <w:pPr>
+              <w:spacing w:after="40"/>
+            </w:pPr>
+            <w:r>
+              <w:rPr>
+                <w:color w:val="1A1A2E"/>
+                <w:sz w:val="20"/>
+                <w:szCs w:val="20"/>
+              </w:rPr>
+              <w:t xml:space="preserve">Access to the relational database is kept </w:t>
+            </w:r>
+            <w:r>
+              <w:rPr>
+                <w:b/>
+                <w:bCs/>
+                <w:color w:val="1A1A2E"/>
+                <w:sz w:val="20"/>
+                <w:szCs w:val="20"/>
+              </w:rPr>
+              <w:t xml:space="preserve">synchronous</w:t>
+            </w:r>
+            <w:r>
+              <w:rPr>
+                <w:color w:val="1A1A2E"/>
+                <w:sz w:val="20"/>
+                <w:szCs w:val="20"/>
+              </w:rPr>
+              <w:t xml:space="preserve"> for simplicity and demo reliability — adequate at hackathon scale and the most readable for review; SQLModel also supports async if ever needed. </w:t>
+            </w:r>
+            <w:r>
+              <w:rPr>
+                <w:b/>
+                <w:bCs/>
+                <w:color w:val="1A1A2E"/>
+                <w:sz w:val="20"/>
+                <w:szCs w:val="20"/>
+              </w:rPr>
+              <w:t xml:space="preserve">Typer</w:t>
+            </w:r>
+            <w:r>
+              <w:rPr>
+                <w:color w:val="1A1A2E"/>
+                <w:sz w:val="20"/>
+                <w:szCs w:val="20"/>
+              </w:rPr>
+              <w:t xml:space="preserve"> (typed CLI) is an optional nicety for the seed script’s flags and is not core scope. </w:t>
+            </w:r>
+            <w:r>
+              <w:rPr>
+                <w:b/>
+                <w:bCs/>
+                <w:color w:val="1A1A2E"/>
+                <w:sz w:val="20"/>
+                <w:szCs w:val="20"/>
+              </w:rPr>
+              <w:t xml:space="preserve">Asyncer</w:t>
+            </w:r>
+            <w:r>
+              <w:rPr>
+                <w:color w:val="1A1A2E"/>
+                <w:sz w:val="20"/>
+                <w:szCs w:val="20"/>
+              </w:rPr>
+              <w:t xml:space="preserve"> (sync/async bridging) is not required and is intentionally omitted unless a concrete need arises.</w:t>
             </w:r>
           </w:p>
         </w:tc>
@@ -7596,7 +7713,7 @@
                 <w:sz w:val="18"/>
                 <w:szCs w:val="18"/>
               </w:rPr>
-              <w:t xml:space="preserve">Clear module boundaries; a single LLMClient wrapper; DB-agnostic ORM; readable for automated + human review.</w:t>
+              <w:t xml:space="preserve">Clear module boundaries; a single LLMClient wrapper; DB-agnostic SQLModel models; readable for automated + human review.</w:t>
             </w:r>
           </w:p>
         </w:tc>
@@ -8879,7 +8996,7 @@
                 <w:sz w:val="18"/>
                 <w:szCs w:val="18"/>
               </w:rPr>
-              <w:t xml:space="preserve">FastAPI app (uv), SQLAlchemy models, auth + roles, Jinja2 shell.</w:t>
+              <w:t xml:space="preserve">FastAPI app (uv), SQLModel models, auth + roles, Jinja2 shell.</w:t>
             </w:r>
           </w:p>
         </w:tc>

</xml_diff>